<commit_message>
Arregla plantilla de certificado y hace robusto el reemplazo de placeholders
- Reconstruye la frase del cuerpo: texto_participacion (intro editable) +
  nombre_curso (evento en negrita), corrigiendo el doble guillemet y los
  guillemets partidos que dejaba Word.
- Agrega mes_anio en la esquina superior derecha.
- El template ahora SI se versiona (antes solo cambiaba local, por eso Streamlit
  Cloud usaba la version vieja con "Guayaquil - Ecuador" y "1 Hora" fijos).
- docx_generator: _repair_placeholder_runs recompone placeholders partidos en
  varios runs; reemplazo nombre_curso; defaults de ciudad/duracion/texto para
  el flujo por lote.

Co-Authored-By: Claude Opus 4.8 <noreply@anthropic.com>
</commit_message>
<xml_diff>
--- a/formato de certificado de asistencia.docx
+++ b/formato de certificado de asistencia.docx
@@ -16,6 +16,15 @@
           <w:szCs w:val="28"/>
         </w:rPr>
       </w:pPr>
+      <w:r>
+        <w:rPr>
+          <w:rFonts w:ascii="Roboto" w:hAnsi="Roboto"/>
+          <w:color w:val="1F3864" w:themeColor="accent5" w:themeShade="80"/>
+          <w:sz w:val="28"/>
+          <w:szCs w:val="28"/>
+        </w:rPr>
+        <w:t>«mes_anio»</w:t>
+      </w:r>
       <w:r>
         <w:rPr>
           <w:rFonts w:ascii="Roboto" w:hAnsi="Roboto"/>
@@ -479,7 +488,356 @@
         <mc:AlternateContent>
           <mc:Choice Requires="wps">
             <w:drawing>
-              <wp:anchor distT="45720" distB="45720" distL="114300" distR="114300" simplePos="0" relativeHeight="251661312" behindDoc="0" locked="0" layoutInCell="1" allowOverlap="1" wp14:anchorId="3FDDB61F" wp14:editId="37A0A75E">
+              <wp:anchor distT="45720" distB="45720" distL="114300" distR="114300" simplePos="0" relativeHeight="251678720" behindDoc="0" locked="0" layoutInCell="1" allowOverlap="1" wp14:anchorId="7330C7CC" wp14:editId="1C9E457B">
+                <wp:simplePos x="0" y="0"/>
+                <wp:positionH relativeFrom="column">
+                  <wp:posOffset>-781262</wp:posOffset>
+                </wp:positionH>
+                <wp:positionV relativeFrom="paragraph">
+                  <wp:posOffset>5810038</wp:posOffset>
+                </wp:positionV>
+                <wp:extent cx="3699934" cy="327025"/>
+                <wp:effectExtent l="0" t="0" r="0" b="0"/>
+                <wp:wrapNone/>
+                <wp:docPr id="5" name="Cuadro de texto 2"/>
+                <wp:cNvGraphicFramePr>
+                  <a:graphicFrameLocks xmlns:a="http://schemas.openxmlformats.org/drawingml/2006/main"/>
+                </wp:cNvGraphicFramePr>
+                <a:graphic xmlns:a="http://schemas.openxmlformats.org/drawingml/2006/main">
+                  <a:graphicData uri="http://schemas.microsoft.com/office/word/2010/wordprocessingShape">
+                    <wps:wsp>
+                      <wps:cNvSpPr txBox="1">
+                        <a:spLocks noChangeArrowheads="1"/>
+                      </wps:cNvSpPr>
+                      <wps:spPr bwMode="auto">
+                        <a:xfrm>
+                          <a:off x="0" y="0"/>
+                          <a:ext cx="3699934" cy="327025"/>
+                        </a:xfrm>
+                        <a:prstGeom prst="rect">
+                          <a:avLst/>
+                        </a:prstGeom>
+                        <a:noFill/>
+                        <a:ln w="9525">
+                          <a:noFill/>
+                          <a:miter lim="800000"/>
+                          <a:headEnd/>
+                          <a:tailEnd/>
+                        </a:ln>
+                      </wps:spPr>
+                      <wps:txbx>
+                        <w:txbxContent>
+                          <w:p>
+                            <w:pPr>
+                              <w:spacing w:after="0"/>
+                            </w:pPr>
+                            <w:r>
+                              <w:rPr>
+                                <w:rFonts w:ascii="Roboto" w:hAnsi="Roboto"/>
+                                <w:color w:val="1F3864" w:themeColor="accent5" w:themeShade="80"/>
+                                <w:sz w:val="24"/>
+                                <w:szCs w:val="28"/>
+                              </w:rPr>
+                              <w:t xml:space="preserve">Código de validación: </w:t>
+                            </w:r>
+                            <w:r>
+                              <w:rPr>
+                                <w:rFonts w:ascii="Roboto" w:hAnsi="Roboto"/>
+                                <w:color w:val="1F3864" w:themeColor="accent5" w:themeShade="80"/>
+                                <w:sz w:val="24"/>
+                                <w:szCs w:val="28"/>
+                              </w:rPr>
+                              <w:fldChar w:fldCharType="begin"/>
+                            </w:r>
+                            <w:r>
+                              <w:rPr>
+                                <w:rFonts w:ascii="Roboto" w:hAnsi="Roboto"/>
+                                <w:color w:val="1F3864" w:themeColor="accent5" w:themeShade="80"/>
+                                <w:sz w:val="24"/>
+                                <w:szCs w:val="28"/>
+                              </w:rPr>
+                              <w:instrText xml:space="preserve"> MERGEFIELD CODIGO </w:instrText>
+                            </w:r>
+                            <w:r>
+                              <w:rPr>
+                                <w:rFonts w:ascii="Roboto" w:hAnsi="Roboto"/>
+                                <w:color w:val="1F3864" w:themeColor="accent5" w:themeShade="80"/>
+                                <w:sz w:val="24"/>
+                                <w:szCs w:val="28"/>
+                              </w:rPr>
+                              <w:fldChar w:fldCharType="separate"/>
+                            </w:r>
+                            <w:r>
+                              <w:rPr>
+                                <w:rFonts w:ascii="Roboto" w:hAnsi="Roboto"/>
+                                <w:noProof/>
+                                <w:color w:val="1F3864" w:themeColor="accent5" w:themeShade="80"/>
+                                <w:sz w:val="24"/>
+                                <w:szCs w:val="28"/>
+                              </w:rPr>
+                              <w:t>«CODIGO»</w:t>
+                            </w:r>
+                            <w:r>
+                              <w:rPr>
+                                <w:rFonts w:ascii="Roboto" w:hAnsi="Roboto"/>
+                                <w:color w:val="1F3864" w:themeColor="accent5" w:themeShade="80"/>
+                                <w:sz w:val="24"/>
+                                <w:szCs w:val="28"/>
+                              </w:rPr>
+                              <w:fldChar w:fldCharType="end"/>
+                            </w:r>
+                          </w:p>
+                          <w:p>
+                            <w:pPr>
+                              <w:spacing w:after="0"/>
+                              <w:jc w:val="center"/>
+                              <w:rPr>
+                                <w:rFonts w:ascii="Roboto" w:hAnsi="Roboto"/>
+                                <w:color w:val="2F5496" w:themeColor="accent5" w:themeShade="BF"/>
+                                <w:sz w:val="32"/>
+                                <w:szCs w:val="28"/>
+                              </w:rPr>
+                            </w:pPr>
+                          </w:p>
+                        </w:txbxContent>
+                      </wps:txbx>
+                      <wps:bodyPr rot="0" vert="horz" wrap="square" lIns="91440" tIns="45720" rIns="91440" bIns="45720" anchor="t" anchorCtr="0">
+                        <a:noAutofit/>
+                      </wps:bodyPr>
+                    </wps:wsp>
+                  </a:graphicData>
+                </a:graphic>
+                <wp14:sizeRelH relativeFrom="margin">
+                  <wp14:pctWidth>0</wp14:pctWidth>
+                </wp14:sizeRelH>
+                <wp14:sizeRelV relativeFrom="margin">
+                  <wp14:pctHeight>0</wp14:pctHeight>
+                </wp14:sizeRelV>
+              </wp:anchor>
+            </w:drawing>
+          </mc:Choice>
+          <mc:Fallback>
+            <w:pict>
+              <v:shape w14:anchorId="7330C7CC" id="_x0000_s1028" type="#_x0000_t202" style="position:absolute;margin-left:-61.5pt;margin-top:457.5pt;width:291.35pt;height:25.75pt;z-index:251678720;visibility:visible;mso-wrap-style:square;mso-width-percent:0;mso-height-percent:0;mso-wrap-distance-left:9pt;mso-wrap-distance-top:3.6pt;mso-wrap-distance-right:9pt;mso-wrap-distance-bottom:3.6pt;mso-position-horizontal:absolute;mso-position-horizontal-relative:text;mso-position-vertical:absolute;mso-position-vertical-relative:text;mso-width-percent:0;mso-height-percent:0;mso-width-relative:margin;mso-height-relative:margin;v-text-anchor:top" o:gfxdata="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" filled="f" stroked="f">
+                <v:textbox>
+                  <w:txbxContent>
+                    <w:p>
+                      <w:pPr>
+                        <w:spacing w:after="0"/>
+                      </w:pPr>
+                      <w:r>
+                        <w:rPr>
+                          <w:rFonts w:ascii="Roboto" w:hAnsi="Roboto"/>
+                          <w:color w:val="1F3864" w:themeColor="accent5" w:themeShade="80"/>
+                          <w:sz w:val="24"/>
+                          <w:szCs w:val="28"/>
+                        </w:rPr>
+                        <w:t xml:space="preserve">Código de validación: </w:t>
+                      </w:r>
+                      <w:r>
+                        <w:rPr>
+                          <w:rFonts w:ascii="Roboto" w:hAnsi="Roboto"/>
+                          <w:color w:val="1F3864" w:themeColor="accent5" w:themeShade="80"/>
+                          <w:sz w:val="24"/>
+                          <w:szCs w:val="28"/>
+                        </w:rPr>
+                        <w:fldChar w:fldCharType="begin"/>
+                      </w:r>
+                      <w:r>
+                        <w:rPr>
+                          <w:rFonts w:ascii="Roboto" w:hAnsi="Roboto"/>
+                          <w:color w:val="1F3864" w:themeColor="accent5" w:themeShade="80"/>
+                          <w:sz w:val="24"/>
+                          <w:szCs w:val="28"/>
+                        </w:rPr>
+                        <w:instrText xml:space="preserve"> MERGEFIELD CODIGO </w:instrText>
+                      </w:r>
+                      <w:r>
+                        <w:rPr>
+                          <w:rFonts w:ascii="Roboto" w:hAnsi="Roboto"/>
+                          <w:color w:val="1F3864" w:themeColor="accent5" w:themeShade="80"/>
+                          <w:sz w:val="24"/>
+                          <w:szCs w:val="28"/>
+                        </w:rPr>
+                        <w:fldChar w:fldCharType="separate"/>
+                      </w:r>
+                      <w:r>
+                        <w:rPr>
+                          <w:rFonts w:ascii="Roboto" w:hAnsi="Roboto"/>
+                          <w:noProof/>
+                          <w:color w:val="1F3864" w:themeColor="accent5" w:themeShade="80"/>
+                          <w:sz w:val="24"/>
+                          <w:szCs w:val="28"/>
+                        </w:rPr>
+                        <w:t>«CODIGO»</w:t>
+                      </w:r>
+                      <w:r>
+                        <w:rPr>
+                          <w:rFonts w:ascii="Roboto" w:hAnsi="Roboto"/>
+                          <w:color w:val="1F3864" w:themeColor="accent5" w:themeShade="80"/>
+                          <w:sz w:val="24"/>
+                          <w:szCs w:val="28"/>
+                        </w:rPr>
+                        <w:fldChar w:fldCharType="end"/>
+                      </w:r>
+                    </w:p>
+                    <w:p>
+                      <w:pPr>
+                        <w:spacing w:after="0"/>
+                        <w:jc w:val="center"/>
+                        <w:rPr>
+                          <w:rFonts w:ascii="Roboto" w:hAnsi="Roboto"/>
+                          <w:color w:val="2F5496" w:themeColor="accent5" w:themeShade="BF"/>
+                          <w:sz w:val="32"/>
+                          <w:szCs w:val="28"/>
+                        </w:rPr>
+                      </w:pPr>
+                    </w:p>
+                  </w:txbxContent>
+                </v:textbox>
+              </v:shape>
+            </w:pict>
+          </mc:Fallback>
+        </mc:AlternateContent>
+      </w:r>
+      <w:r>
+        <w:rPr>
+          <w:rFonts w:ascii="Roboto" w:hAnsi="Roboto"/>
+          <w:noProof/>
+          <w:color w:val="1F3864" w:themeColor="accent5" w:themeShade="80"/>
+          <w:sz w:val="21"/>
+          <w:lang w:eastAsia="es-EC"/>
+        </w:rPr>
+        <mc:AlternateContent>
+          <mc:Choice Requires="wps">
+            <w:drawing>
+              <wp:anchor distT="45720" distB="45720" distL="114300" distR="114300" simplePos="0" relativeHeight="251674624" behindDoc="0" locked="0" layoutInCell="1" allowOverlap="1" wp14:anchorId="1283D52C" wp14:editId="065C3A6F">
+                <wp:simplePos x="0" y="0"/>
+                <wp:positionH relativeFrom="column">
+                  <wp:posOffset>1351915</wp:posOffset>
+                </wp:positionH>
+                <wp:positionV relativeFrom="paragraph">
+                  <wp:posOffset>1229360</wp:posOffset>
+                </wp:positionV>
+                <wp:extent cx="6358255" cy="1404620"/>
+                <wp:effectExtent l="0" t="0" r="0" b="0"/>
+                <wp:wrapSquare wrapText="bothSides"/>
+                <wp:docPr id="10" name="Cuadro de texto 2"/>
+                <wp:cNvGraphicFramePr>
+                  <a:graphicFrameLocks xmlns:a="http://schemas.openxmlformats.org/drawingml/2006/main"/>
+                </wp:cNvGraphicFramePr>
+                <a:graphic xmlns:a="http://schemas.openxmlformats.org/drawingml/2006/main">
+                  <a:graphicData uri="http://schemas.microsoft.com/office/word/2010/wordprocessingShape">
+                    <wps:wsp>
+                      <wps:cNvSpPr txBox="1">
+                        <a:spLocks noChangeArrowheads="1"/>
+                      </wps:cNvSpPr>
+                      <wps:spPr bwMode="auto">
+                        <a:xfrm>
+                          <a:off x="0" y="0"/>
+                          <a:ext cx="6358255" cy="1404620"/>
+                        </a:xfrm>
+                        <a:prstGeom prst="rect">
+                          <a:avLst/>
+                        </a:prstGeom>
+                        <a:noFill/>
+                        <a:ln w="9525">
+                          <a:noFill/>
+                          <a:miter lim="800000"/>
+                          <a:headEnd/>
+                          <a:tailEnd/>
+                        </a:ln>
+                      </wps:spPr>
+                      <wps:txbx>
+                        <w:txbxContent>
+                          <w:p>
+                            <w:pPr>
+                              <w:spacing w:after="0" w:line="240" w:lineRule="auto"/>
+                              <w:jc w:val="center"/>
+                              <w:rPr>
+                                <w:rFonts w:ascii="Roboto Light" w:eastAsia="Times New Roman" w:hAnsi="Roboto Light" w:cs="Times New Roman"/>
+                                <w:color w:val="2F5496" w:themeColor="accent5" w:themeShade="BF"/>
+                                <w:sz w:val="48"/>
+                                <w:szCs w:val="24"/>
+                                <w:lang w:val="es-419" w:eastAsia="es-ES_tradnl"/>
+                              </w:rPr>
+                            </w:pPr>
+                            <w:r>
+                              <w:rPr>
+                                <w:rFonts w:ascii="Roboto Light" w:eastAsia="Times New Roman" w:hAnsi="Roboto Light" w:cs="Times New Roman"/>
+                                <w:color w:val="2F5496" w:themeColor="accent5" w:themeShade="BF"/>
+                                <w:sz w:val="48"/>
+                                <w:szCs w:val="24"/>
+                                <w:lang w:val="es-419" w:eastAsia="es-ES_tradnl"/>
+                              </w:rPr>
+                              <w:t>Otorga el presente certificado a:</w:t>
+                            </w:r>
+                          </w:p>
+                        </w:txbxContent>
+                      </wps:txbx>
+                      <wps:bodyPr rot="0" vert="horz" wrap="square" lIns="91440" tIns="45720" rIns="91440" bIns="45720" anchor="t" anchorCtr="0">
+                        <a:spAutoFit/>
+                      </wps:bodyPr>
+                    </wps:wsp>
+                  </a:graphicData>
+                </a:graphic>
+                <wp14:sizeRelH relativeFrom="margin">
+                  <wp14:pctWidth>0</wp14:pctWidth>
+                </wp14:sizeRelH>
+                <wp14:sizeRelV relativeFrom="margin">
+                  <wp14:pctHeight>20000</wp14:pctHeight>
+                </wp14:sizeRelV>
+              </wp:anchor>
+            </w:drawing>
+          </mc:Choice>
+          <mc:Fallback>
+            <w:pict>
+              <v:shape w14:anchorId="1283D52C" id="_x0000_s1029" type="#_x0000_t202" style="position:absolute;margin-left:106.45pt;margin-top:96.8pt;width:500.65pt;height:110.6pt;z-index:251674624;visibility:visible;mso-wrap-style:square;mso-width-percent:0;mso-height-percent:200;mso-wrap-distance-left:9pt;mso-wrap-distance-top:3.6pt;mso-wrap-distance-right:9pt;mso-wrap-distance-bottom:3.6pt;mso-position-horizontal:absolute;mso-position-horizontal-relative:text;mso-position-vertical:absolute;mso-position-vertical-relative:text;mso-width-percent:0;mso-height-percent:200;mso-width-relative:margin;mso-height-relative:margin;v-text-anchor:top" o:gfxdata="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" filled="f" stroked="f">
+                <v:textbox style="mso-fit-shape-to-text:t">
+                  <w:txbxContent>
+                    <w:p>
+                      <w:pPr>
+                        <w:spacing w:after="0" w:line="240" w:lineRule="auto"/>
+                        <w:jc w:val="center"/>
+                        <w:rPr>
+                          <w:rFonts w:ascii="Roboto Light" w:eastAsia="Times New Roman" w:hAnsi="Roboto Light" w:cs="Times New Roman"/>
+                          <w:color w:val="2F5496" w:themeColor="accent5" w:themeShade="BF"/>
+                          <w:sz w:val="48"/>
+                          <w:szCs w:val="24"/>
+                          <w:lang w:val="es-419" w:eastAsia="es-ES_tradnl"/>
+                        </w:rPr>
+                      </w:pPr>
+                      <w:r>
+                        <w:rPr>
+                          <w:rFonts w:ascii="Roboto Light" w:eastAsia="Times New Roman" w:hAnsi="Roboto Light" w:cs="Times New Roman"/>
+                          <w:color w:val="2F5496" w:themeColor="accent5" w:themeShade="BF"/>
+                          <w:sz w:val="48"/>
+                          <w:szCs w:val="24"/>
+                          <w:lang w:val="es-419" w:eastAsia="es-ES_tradnl"/>
+                        </w:rPr>
+                        <w:t>Otorga el presente certificado a:</w:t>
+                      </w:r>
+                    </w:p>
+                  </w:txbxContent>
+                </v:textbox>
+                <w10:wrap type="square"/>
+              </v:shape>
+            </w:pict>
+          </mc:Fallback>
+        </mc:AlternateContent>
+      </w:r>
+      <w:r>
+        <w:rPr>
+          <w:rFonts w:ascii="Roboto" w:hAnsi="Roboto"/>
+          <w:noProof/>
+          <w:color w:val="1F3864" w:themeColor="accent5" w:themeShade="80"/>
+          <w:sz w:val="21"/>
+          <w:lang w:eastAsia="es-EC"/>
+        </w:rPr>
+        <mc:AlternateContent>
+          <mc:Choice Requires="wps">
+            <w:drawing>
+              <wp:anchor distT="45720" distB="45720" distL="114300" distR="114300" simplePos="0" relativeHeight="251661312" behindDoc="0" locked="0" layoutInCell="1" allowOverlap="1" wp14:anchorId="3FDDB61F" wp14:editId="00CF9F92">
                 <wp:simplePos x="0" y="0"/>
                 <wp:positionH relativeFrom="column">
                   <wp:posOffset>261691</wp:posOffset>
@@ -525,16 +883,16 @@
                               <w:rPr>
                                 <w:rFonts w:ascii="Roboto" w:hAnsi="Roboto"/>
                                 <w:color w:val="2F5496" w:themeColor="accent5" w:themeShade="BF"/>
-                                <w:sz w:val="28"/>
-                                <w:szCs w:val="28"/>
+                                <w:sz w:val="32"/>
+                                <w:szCs w:val="32"/>
                               </w:rPr>
                             </w:pPr>
                             <w:r>
                               <w:rPr>
                                 <w:rFonts w:ascii="Roboto" w:hAnsi="Roboto"/>
                                 <w:color w:val="2F5496" w:themeColor="accent5" w:themeShade="BF"/>
-                                <w:sz w:val="28"/>
-                                <w:szCs w:val="28"/>
+                                <w:sz w:val="32"/>
+                                <w:szCs w:val="32"/>
                               </w:rPr>
                               <w:t xml:space="preserve">Con </w:t>
                             </w:r>
@@ -543,8 +901,8 @@
                               <w:rPr>
                                 <w:rFonts w:ascii="Roboto" w:hAnsi="Roboto"/>
                                 <w:color w:val="2F5496" w:themeColor="accent5" w:themeShade="BF"/>
-                                <w:sz w:val="28"/>
-                                <w:szCs w:val="28"/>
+                                <w:sz w:val="32"/>
+                                <w:szCs w:val="32"/>
                               </w:rPr>
                               <w:t xml:space="preserve">C.I. </w:t>
                             </w:r>
@@ -553,8 +911,8 @@
                               <w:rPr>
                                 <w:rFonts w:ascii="Roboto" w:hAnsi="Roboto"/>
                                 <w:color w:val="2F5496" w:themeColor="accent5" w:themeShade="BF"/>
-                                <w:sz w:val="28"/>
-                                <w:szCs w:val="28"/>
+                                <w:sz w:val="32"/>
+                                <w:szCs w:val="32"/>
                               </w:rPr>
                               <w:fldChar w:fldCharType="begin"/>
                             </w:r>
@@ -562,8 +920,8 @@
                               <w:rPr>
                                 <w:rFonts w:ascii="Roboto" w:hAnsi="Roboto"/>
                                 <w:color w:val="2F5496" w:themeColor="accent5" w:themeShade="BF"/>
-                                <w:sz w:val="28"/>
-                                <w:szCs w:val="28"/>
+                                <w:sz w:val="32"/>
+                                <w:szCs w:val="32"/>
                               </w:rPr>
                               <w:instrText xml:space="preserve"> MERGEFIELD Número_de_cédula </w:instrText>
                             </w:r>
@@ -571,8 +929,8 @@
                               <w:rPr>
                                 <w:rFonts w:ascii="Roboto" w:hAnsi="Roboto"/>
                                 <w:color w:val="2F5496" w:themeColor="accent5" w:themeShade="BF"/>
-                                <w:sz w:val="28"/>
-                                <w:szCs w:val="28"/>
+                                <w:sz w:val="32"/>
+                                <w:szCs w:val="32"/>
                               </w:rPr>
                               <w:fldChar w:fldCharType="separate"/>
                             </w:r>
@@ -581,8 +939,8 @@
                                 <w:rFonts w:ascii="Roboto" w:hAnsi="Roboto"/>
                                 <w:noProof/>
                                 <w:color w:val="2F5496" w:themeColor="accent5" w:themeShade="BF"/>
-                                <w:sz w:val="28"/>
-                                <w:szCs w:val="28"/>
+                                <w:sz w:val="32"/>
+                                <w:szCs w:val="32"/>
                               </w:rPr>
                               <w:t>«Número_de_cédula»</w:t>
                             </w:r>
@@ -590,8 +948,8 @@
                               <w:rPr>
                                 <w:rFonts w:ascii="Roboto" w:hAnsi="Roboto"/>
                                 <w:color w:val="2F5496" w:themeColor="accent5" w:themeShade="BF"/>
-                                <w:sz w:val="28"/>
-                                <w:szCs w:val="28"/>
+                                <w:sz w:val="32"/>
+                                <w:szCs w:val="32"/>
                               </w:rPr>
                               <w:fldChar w:fldCharType="end"/>
                             </w:r>
@@ -604,7 +962,7 @@
                                 <w:rFonts w:ascii="Roboto" w:hAnsi="Roboto"/>
                                 <w:color w:val="2F5496" w:themeColor="accent5" w:themeShade="BF"/>
                                 <w:sz w:val="32"/>
-                                <w:szCs w:val="28"/>
+                                <w:szCs w:val="32"/>
                               </w:rPr>
                             </w:pPr>
                             <w:r>
@@ -612,9 +970,9 @@
                                 <w:rFonts w:ascii="Roboto" w:hAnsi="Roboto"/>
                                 <w:color w:val="2F5496" w:themeColor="accent5" w:themeShade="BF"/>
                                 <w:sz w:val="32"/>
-                                <w:szCs w:val="28"/>
-                              </w:rPr>
-                              <w:t xml:space="preserve">Por su participación en la capacitación en materia de competencia sobre la </w:t>
+                                <w:szCs w:val="32"/>
+                              </w:rPr>
+                              <w:t xml:space="preserve">«texto_participacion» </w:t>
                             </w:r>
                             <w:r>
                               <w:rPr>
@@ -622,25 +980,43 @@
                                 <w:b/>
                                 <w:color w:val="2F5496" w:themeColor="accent5" w:themeShade="BF"/>
                                 <w:sz w:val="32"/>
-                                <w:szCs w:val="28"/>
-                              </w:rPr>
-                              <w:t>“Socialización a la Ley Orgánica de Regulación y Control del Poder de Mercado”,</w:t>
+                                <w:szCs w:val="32"/>
+                              </w:rPr>
+                              <w:t xml:space="preserve">“«nombre_curso»”, </w:t>
                             </w:r>
                             <w:r>
                               <w:rPr>
                                 <w:rFonts w:ascii="Roboto" w:hAnsi="Roboto"/>
                                 <w:color w:val="2F5496" w:themeColor="accent5" w:themeShade="BF"/>
                                 <w:sz w:val="32"/>
-                                <w:szCs w:val="28"/>
-                              </w:rPr>
-                              <w:t xml:space="preserve"> realizada en la ciudad de Guayaquil - Ecuador, el </w:t>
+                                <w:szCs w:val="32"/>
+                              </w:rPr>
+                              <w:t xml:space="preserve">realizada en la ciudad de </w:t>
                             </w:r>
                             <w:r>
                               <w:rPr>
                                 <w:rFonts w:ascii="Roboto" w:hAnsi="Roboto"/>
                                 <w:color w:val="2F5496" w:themeColor="accent5" w:themeShade="BF"/>
                                 <w:sz w:val="32"/>
-                                <w:szCs w:val="28"/>
+                                <w:szCs w:val="32"/>
+                              </w:rPr>
+                              <w:t xml:space="preserve">«ciudad» </w:t>
+                            </w:r>
+                            <w:r>
+                              <w:rPr>
+                                <w:rFonts w:ascii="Roboto" w:hAnsi="Roboto"/>
+                                <w:color w:val="2F5496" w:themeColor="accent5" w:themeShade="BF"/>
+                                <w:sz w:val="32"/>
+                                <w:szCs w:val="32"/>
+                              </w:rPr>
+                              <w:t xml:space="preserve">- Ecuador, el </w:t>
+                            </w:r>
+                            <w:r>
+                              <w:rPr>
+                                <w:rFonts w:ascii="Roboto" w:hAnsi="Roboto"/>
+                                <w:color w:val="2F5496" w:themeColor="accent5" w:themeShade="BF"/>
+                                <w:sz w:val="32"/>
+                                <w:szCs w:val="32"/>
                               </w:rPr>
                               <w:t>xxxxxx</w:t>
                             </w:r>
@@ -649,9 +1025,27 @@
                                 <w:rFonts w:ascii="Roboto" w:hAnsi="Roboto"/>
                                 <w:color w:val="2F5496" w:themeColor="accent5" w:themeShade="BF"/>
                                 <w:sz w:val="32"/>
-                                <w:szCs w:val="28"/>
-                              </w:rPr>
-                              <w:t xml:space="preserve"> de 2025 (1 Hora de duración).</w:t>
+                                <w:szCs w:val="32"/>
+                              </w:rPr>
+                              <w:t xml:space="preserve"> de 2025 (</w:t>
+                            </w:r>
+                            <w:r>
+                              <w:rPr>
+                                <w:rFonts w:ascii="Roboto" w:hAnsi="Roboto"/>
+                                <w:color w:val="2F5496" w:themeColor="accent5" w:themeShade="BF"/>
+                                <w:sz w:val="32"/>
+                                <w:szCs w:val="32"/>
+                              </w:rPr>
+                              <w:t>«duracion»</w:t>
+                            </w:r>
+                            <w:r>
+                              <w:rPr>
+                                <w:rFonts w:ascii="Roboto" w:hAnsi="Roboto"/>
+                                <w:color w:val="2F5496" w:themeColor="accent5" w:themeShade="BF"/>
+                                <w:sz w:val="32"/>
+                                <w:szCs w:val="32"/>
+                              </w:rPr>
+                              <w:t xml:space="preserve"> de duración).</w:t>
                             </w:r>
                           </w:p>
                         </w:txbxContent>
@@ -673,7 +1067,7 @@
           </mc:Choice>
           <mc:Fallback>
             <w:pict>
-              <v:shape w14:anchorId="3FDDB61F" id="_x0000_s1028" type="#_x0000_t202" style="position:absolute;margin-left:20.6pt;margin-top:241.6pt;width:653.3pt;height:110.6pt;z-index:251661312;visibility:visible;mso-wrap-style:square;mso-width-percent:0;mso-height-percent:200;mso-wrap-distance-left:9pt;mso-wrap-distance-top:3.6pt;mso-wrap-distance-right:9pt;mso-wrap-distance-bottom:3.6pt;mso-position-horizontal:absolute;mso-position-horizontal-relative:text;mso-position-vertical:absolute;mso-position-vertical-relative:text;mso-width-percent:0;mso-height-percent:200;mso-width-relative:margin;mso-height-relative:margin;v-text-anchor:top" o:gfxdata="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" filled="f" stroked="f">
+              <v:shape w14:anchorId="3FDDB61F" id="_x0000_s1030" type="#_x0000_t202" style="position:absolute;margin-left:20.6pt;margin-top:241.6pt;width:653.3pt;height:110.6pt;z-index:251661312;visibility:visible;mso-wrap-style:square;mso-width-percent:0;mso-height-percent:200;mso-wrap-distance-left:9pt;mso-wrap-distance-top:3.6pt;mso-wrap-distance-right:9pt;mso-wrap-distance-bottom:3.6pt;mso-position-horizontal:absolute;mso-position-horizontal-relative:text;mso-position-vertical:absolute;mso-position-vertical-relative:text;mso-width-percent:0;mso-height-percent:200;mso-width-relative:margin;mso-height-relative:margin;v-text-anchor:top" o:gfxdata="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" filled="f" stroked="f">
                 <v:textbox style="mso-fit-shape-to-text:t">
                   <w:txbxContent>
                     <w:p>
@@ -683,16 +1077,16 @@
                         <w:rPr>
                           <w:rFonts w:ascii="Roboto" w:hAnsi="Roboto"/>
                           <w:color w:val="2F5496" w:themeColor="accent5" w:themeShade="BF"/>
-                          <w:sz w:val="28"/>
-                          <w:szCs w:val="28"/>
+                          <w:sz w:val="32"/>
+                          <w:szCs w:val="32"/>
                         </w:rPr>
                       </w:pPr>
                       <w:r>
                         <w:rPr>
                           <w:rFonts w:ascii="Roboto" w:hAnsi="Roboto"/>
                           <w:color w:val="2F5496" w:themeColor="accent5" w:themeShade="BF"/>
-                          <w:sz w:val="28"/>
-                          <w:szCs w:val="28"/>
+                          <w:sz w:val="32"/>
+                          <w:szCs w:val="32"/>
                         </w:rPr>
                         <w:t xml:space="preserve">Con </w:t>
                       </w:r>
@@ -701,8 +1095,8 @@
                         <w:rPr>
                           <w:rFonts w:ascii="Roboto" w:hAnsi="Roboto"/>
                           <w:color w:val="2F5496" w:themeColor="accent5" w:themeShade="BF"/>
-                          <w:sz w:val="28"/>
-                          <w:szCs w:val="28"/>
+                          <w:sz w:val="32"/>
+                          <w:szCs w:val="32"/>
                         </w:rPr>
                         <w:t xml:space="preserve">C.I. </w:t>
                       </w:r>
@@ -711,8 +1105,8 @@
                         <w:rPr>
                           <w:rFonts w:ascii="Roboto" w:hAnsi="Roboto"/>
                           <w:color w:val="2F5496" w:themeColor="accent5" w:themeShade="BF"/>
-                          <w:sz w:val="28"/>
-                          <w:szCs w:val="28"/>
+                          <w:sz w:val="32"/>
+                          <w:szCs w:val="32"/>
                         </w:rPr>
                         <w:fldChar w:fldCharType="begin"/>
                       </w:r>
@@ -720,8 +1114,8 @@
                         <w:rPr>
                           <w:rFonts w:ascii="Roboto" w:hAnsi="Roboto"/>
                           <w:color w:val="2F5496" w:themeColor="accent5" w:themeShade="BF"/>
-                          <w:sz w:val="28"/>
-                          <w:szCs w:val="28"/>
+                          <w:sz w:val="32"/>
+                          <w:szCs w:val="32"/>
                         </w:rPr>
                         <w:instrText xml:space="preserve"> MERGEFIELD Número_de_cédula </w:instrText>
                       </w:r>
@@ -729,8 +1123,8 @@
                         <w:rPr>
                           <w:rFonts w:ascii="Roboto" w:hAnsi="Roboto"/>
                           <w:color w:val="2F5496" w:themeColor="accent5" w:themeShade="BF"/>
-                          <w:sz w:val="28"/>
-                          <w:szCs w:val="28"/>
+                          <w:sz w:val="32"/>
+                          <w:szCs w:val="32"/>
                         </w:rPr>
                         <w:fldChar w:fldCharType="separate"/>
                       </w:r>
@@ -739,8 +1133,8 @@
                           <w:rFonts w:ascii="Roboto" w:hAnsi="Roboto"/>
                           <w:noProof/>
                           <w:color w:val="2F5496" w:themeColor="accent5" w:themeShade="BF"/>
-                          <w:sz w:val="28"/>
-                          <w:szCs w:val="28"/>
+                          <w:sz w:val="32"/>
+                          <w:szCs w:val="32"/>
                         </w:rPr>
                         <w:t>«Número_de_cédula»</w:t>
                       </w:r>
@@ -748,8 +1142,8 @@
                         <w:rPr>
                           <w:rFonts w:ascii="Roboto" w:hAnsi="Roboto"/>
                           <w:color w:val="2F5496" w:themeColor="accent5" w:themeShade="BF"/>
-                          <w:sz w:val="28"/>
-                          <w:szCs w:val="28"/>
+                          <w:sz w:val="32"/>
+                          <w:szCs w:val="32"/>
                         </w:rPr>
                         <w:fldChar w:fldCharType="end"/>
                       </w:r>
@@ -762,7 +1156,7 @@
                           <w:rFonts w:ascii="Roboto" w:hAnsi="Roboto"/>
                           <w:color w:val="2F5496" w:themeColor="accent5" w:themeShade="BF"/>
                           <w:sz w:val="32"/>
-                          <w:szCs w:val="28"/>
+                          <w:szCs w:val="32"/>
                         </w:rPr>
                       </w:pPr>
                       <w:r>
@@ -770,9 +1164,9 @@
                           <w:rFonts w:ascii="Roboto" w:hAnsi="Roboto"/>
                           <w:color w:val="2F5496" w:themeColor="accent5" w:themeShade="BF"/>
                           <w:sz w:val="32"/>
-                          <w:szCs w:val="28"/>
-                        </w:rPr>
-                        <w:t xml:space="preserve">Por su participación en la capacitación en materia de competencia sobre la </w:t>
+                          <w:szCs w:val="32"/>
+                        </w:rPr>
+                        <w:t xml:space="preserve">«texto_participacion» </w:t>
                       </w:r>
                       <w:r>
                         <w:rPr>
@@ -780,25 +1174,43 @@
                           <w:b/>
                           <w:color w:val="2F5496" w:themeColor="accent5" w:themeShade="BF"/>
                           <w:sz w:val="32"/>
-                          <w:szCs w:val="28"/>
-                        </w:rPr>
-                        <w:t>“Socialización a la Ley Orgánica de Regulación y Control del Poder de Mercado”,</w:t>
+                          <w:szCs w:val="32"/>
+                        </w:rPr>
+                        <w:t xml:space="preserve">“«nombre_curso»”, </w:t>
                       </w:r>
                       <w:r>
                         <w:rPr>
                           <w:rFonts w:ascii="Roboto" w:hAnsi="Roboto"/>
                           <w:color w:val="2F5496" w:themeColor="accent5" w:themeShade="BF"/>
                           <w:sz w:val="32"/>
-                          <w:szCs w:val="28"/>
-                        </w:rPr>
-                        <w:t xml:space="preserve"> realizada en la ciudad de Guayaquil - Ecuador, el </w:t>
+                          <w:szCs w:val="32"/>
+                        </w:rPr>
+                        <w:t xml:space="preserve">realizada en la ciudad de </w:t>
                       </w:r>
                       <w:r>
                         <w:rPr>
                           <w:rFonts w:ascii="Roboto" w:hAnsi="Roboto"/>
                           <w:color w:val="2F5496" w:themeColor="accent5" w:themeShade="BF"/>
                           <w:sz w:val="32"/>
-                          <w:szCs w:val="28"/>
+                          <w:szCs w:val="32"/>
+                        </w:rPr>
+                        <w:t xml:space="preserve">«ciudad» </w:t>
+                      </w:r>
+                      <w:r>
+                        <w:rPr>
+                          <w:rFonts w:ascii="Roboto" w:hAnsi="Roboto"/>
+                          <w:color w:val="2F5496" w:themeColor="accent5" w:themeShade="BF"/>
+                          <w:sz w:val="32"/>
+                          <w:szCs w:val="32"/>
+                        </w:rPr>
+                        <w:t xml:space="preserve">- Ecuador, el </w:t>
+                      </w:r>
+                      <w:r>
+                        <w:rPr>
+                          <w:rFonts w:ascii="Roboto" w:hAnsi="Roboto"/>
+                          <w:color w:val="2F5496" w:themeColor="accent5" w:themeShade="BF"/>
+                          <w:sz w:val="32"/>
+                          <w:szCs w:val="32"/>
                         </w:rPr>
                         <w:t>xxxxxx</w:t>
                       </w:r>
@@ -807,360 +1219,28 @@
                           <w:rFonts w:ascii="Roboto" w:hAnsi="Roboto"/>
                           <w:color w:val="2F5496" w:themeColor="accent5" w:themeShade="BF"/>
                           <w:sz w:val="32"/>
-                          <w:szCs w:val="28"/>
-                        </w:rPr>
-                        <w:t xml:space="preserve"> de 2025 (1 Hora de duración).</w:t>
-                      </w:r>
-                    </w:p>
-                  </w:txbxContent>
-                </v:textbox>
-                <w10:wrap type="square"/>
-              </v:shape>
-            </w:pict>
-          </mc:Fallback>
-        </mc:AlternateContent>
-      </w:r>
-      <w:r>
-        <w:rPr>
-          <w:rFonts w:ascii="Roboto" w:hAnsi="Roboto"/>
-          <w:noProof/>
-          <w:color w:val="1F3864" w:themeColor="accent5" w:themeShade="80"/>
-          <w:sz w:val="21"/>
-          <w:lang w:eastAsia="es-EC"/>
-        </w:rPr>
-        <mc:AlternateContent>
-          <mc:Choice Requires="wps">
-            <w:drawing>
-              <wp:anchor distT="45720" distB="45720" distL="114300" distR="114300" simplePos="0" relativeHeight="251674624" behindDoc="0" locked="0" layoutInCell="1" allowOverlap="1" wp14:anchorId="1283D52C" wp14:editId="6695B41A">
-                <wp:simplePos x="0" y="0"/>
-                <wp:positionH relativeFrom="column">
-                  <wp:posOffset>2136775</wp:posOffset>
-                </wp:positionH>
-                <wp:positionV relativeFrom="paragraph">
-                  <wp:posOffset>1227667</wp:posOffset>
-                </wp:positionV>
-                <wp:extent cx="4695825" cy="1404620"/>
-                <wp:effectExtent l="0" t="0" r="0" b="0"/>
-                <wp:wrapSquare wrapText="bothSides"/>
-                <wp:docPr id="10" name="Cuadro de texto 2"/>
-                <wp:cNvGraphicFramePr>
-                  <a:graphicFrameLocks xmlns:a="http://schemas.openxmlformats.org/drawingml/2006/main"/>
-                </wp:cNvGraphicFramePr>
-                <a:graphic xmlns:a="http://schemas.openxmlformats.org/drawingml/2006/main">
-                  <a:graphicData uri="http://schemas.microsoft.com/office/word/2010/wordprocessingShape">
-                    <wps:wsp>
-                      <wps:cNvSpPr txBox="1">
-                        <a:spLocks noChangeArrowheads="1"/>
-                      </wps:cNvSpPr>
-                      <wps:spPr bwMode="auto">
-                        <a:xfrm>
-                          <a:off x="0" y="0"/>
-                          <a:ext cx="4695825" cy="1404620"/>
-                        </a:xfrm>
-                        <a:prstGeom prst="rect">
-                          <a:avLst/>
-                        </a:prstGeom>
-                        <a:noFill/>
-                        <a:ln w="9525">
-                          <a:noFill/>
-                          <a:miter lim="800000"/>
-                          <a:headEnd/>
-                          <a:tailEnd/>
-                        </a:ln>
-                      </wps:spPr>
-                      <wps:txbx>
-                        <w:txbxContent>
-                          <w:p>
-                            <w:pPr>
-                              <w:spacing w:after="0" w:line="240" w:lineRule="auto"/>
-                              <w:jc w:val="center"/>
-                              <w:rPr>
-                                <w:rFonts w:ascii="Roboto Light" w:eastAsia="Times New Roman" w:hAnsi="Roboto Light" w:cs="Times New Roman"/>
-                                <w:color w:val="2F5496" w:themeColor="accent5" w:themeShade="BF"/>
-                                <w:sz w:val="48"/>
-                                <w:szCs w:val="24"/>
-                                <w:lang w:val="es-419" w:eastAsia="es-ES_tradnl"/>
-                              </w:rPr>
-                            </w:pPr>
-                            <w:r>
-                              <w:rPr>
-                                <w:rFonts w:ascii="Roboto Light" w:eastAsia="Times New Roman" w:hAnsi="Roboto Light" w:cs="Times New Roman"/>
-                                <w:color w:val="2F5496" w:themeColor="accent5" w:themeShade="BF"/>
-                                <w:sz w:val="48"/>
-                                <w:szCs w:val="24"/>
-                                <w:lang w:val="es-419" w:eastAsia="es-ES_tradnl"/>
-                              </w:rPr>
-                              <w:t>Otorga el presente certificado a:</w:t>
-                            </w:r>
-                          </w:p>
-                        </w:txbxContent>
-                      </wps:txbx>
-                      <wps:bodyPr rot="0" vert="horz" wrap="square" lIns="91440" tIns="45720" rIns="91440" bIns="45720" anchor="t" anchorCtr="0">
-                        <a:spAutoFit/>
-                      </wps:bodyPr>
-                    </wps:wsp>
-                  </a:graphicData>
-                </a:graphic>
-                <wp14:sizeRelH relativeFrom="margin">
-                  <wp14:pctWidth>0</wp14:pctWidth>
-                </wp14:sizeRelH>
-                <wp14:sizeRelV relativeFrom="margin">
-                  <wp14:pctHeight>20000</wp14:pctHeight>
-                </wp14:sizeRelV>
-              </wp:anchor>
-            </w:drawing>
-          </mc:Choice>
-          <mc:Fallback>
-            <w:pict>
-              <v:shape w14:anchorId="1283D52C" id="_x0000_s1029" type="#_x0000_t202" style="position:absolute;margin-left:168.25pt;margin-top:96.65pt;width:369.75pt;height:110.6pt;z-index:251674624;visibility:visible;mso-wrap-style:square;mso-width-percent:0;mso-height-percent:200;mso-wrap-distance-left:9pt;mso-wrap-distance-top:3.6pt;mso-wrap-distance-right:9pt;mso-wrap-distance-bottom:3.6pt;mso-position-horizontal:absolute;mso-position-horizontal-relative:text;mso-position-vertical:absolute;mso-position-vertical-relative:text;mso-width-percent:0;mso-height-percent:200;mso-width-relative:margin;mso-height-relative:margin;v-text-anchor:top" o:gfxdata="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" filled="f" stroked="f">
-                <v:textbox style="mso-fit-shape-to-text:t">
-                  <w:txbxContent>
-                    <w:p>
-                      <w:pPr>
-                        <w:spacing w:after="0" w:line="240" w:lineRule="auto"/>
-                        <w:jc w:val="center"/>
-                        <w:rPr>
-                          <w:rFonts w:ascii="Roboto Light" w:eastAsia="Times New Roman" w:hAnsi="Roboto Light" w:cs="Times New Roman"/>
-                          <w:color w:val="2F5496" w:themeColor="accent5" w:themeShade="BF"/>
-                          <w:sz w:val="48"/>
-                          <w:szCs w:val="24"/>
-                          <w:lang w:val="es-419" w:eastAsia="es-ES_tradnl"/>
-                        </w:rPr>
-                      </w:pPr>
-                      <w:r>
-                        <w:rPr>
-                          <w:rFonts w:ascii="Roboto Light" w:eastAsia="Times New Roman" w:hAnsi="Roboto Light" w:cs="Times New Roman"/>
-                          <w:color w:val="2F5496" w:themeColor="accent5" w:themeShade="BF"/>
-                          <w:sz w:val="48"/>
-                          <w:szCs w:val="24"/>
-                          <w:lang w:val="es-419" w:eastAsia="es-ES_tradnl"/>
-                        </w:rPr>
-                        <w:t>Otorga el presente certificado a:</w:t>
-                      </w:r>
-                    </w:p>
-                  </w:txbxContent>
-                </v:textbox>
-                <w10:wrap type="square"/>
-              </v:shape>
-            </w:pict>
-          </mc:Fallback>
-        </mc:AlternateContent>
-      </w:r>
-      <w:r>
-        <w:rPr>
-          <w:rFonts w:ascii="Roboto" w:hAnsi="Roboto"/>
-          <w:noProof/>
-          <w:color w:val="1F3864" w:themeColor="accent5" w:themeShade="80"/>
-          <w:sz w:val="21"/>
-          <w:lang w:eastAsia="es-EC"/>
-        </w:rPr>
-        <mc:AlternateContent>
-          <mc:Choice Requires="wps">
-            <w:drawing>
-              <wp:anchor distT="45720" distB="45720" distL="114300" distR="114300" simplePos="0" relativeHeight="251678720" behindDoc="0" locked="0" layoutInCell="1" allowOverlap="1" wp14:anchorId="7330C7CC" wp14:editId="316DD6A5">
-                <wp:simplePos x="0" y="0"/>
-                <wp:positionH relativeFrom="column">
-                  <wp:posOffset>7092174</wp:posOffset>
-                </wp:positionH>
-                <wp:positionV relativeFrom="paragraph">
-                  <wp:posOffset>4852740</wp:posOffset>
-                </wp:positionV>
-                <wp:extent cx="2472055" cy="327025"/>
-                <wp:effectExtent l="0" t="0" r="0" b="0"/>
-                <wp:wrapSquare wrapText="bothSides"/>
-                <wp:docPr id="5" name="Cuadro de texto 2"/>
-                <wp:cNvGraphicFramePr>
-                  <a:graphicFrameLocks xmlns:a="http://schemas.openxmlformats.org/drawingml/2006/main"/>
-                </wp:cNvGraphicFramePr>
-                <a:graphic xmlns:a="http://schemas.openxmlformats.org/drawingml/2006/main">
-                  <a:graphicData uri="http://schemas.microsoft.com/office/word/2010/wordprocessingShape">
-                    <wps:wsp>
-                      <wps:cNvSpPr txBox="1">
-                        <a:spLocks noChangeArrowheads="1"/>
-                      </wps:cNvSpPr>
-                      <wps:spPr bwMode="auto">
-                        <a:xfrm>
-                          <a:off x="0" y="0"/>
-                          <a:ext cx="2472055" cy="327025"/>
-                        </a:xfrm>
-                        <a:prstGeom prst="rect">
-                          <a:avLst/>
-                        </a:prstGeom>
-                        <a:noFill/>
-                        <a:ln w="9525">
-                          <a:noFill/>
-                          <a:miter lim="800000"/>
-                          <a:headEnd/>
-                          <a:tailEnd/>
-                        </a:ln>
-                      </wps:spPr>
-                      <wps:txbx>
-                        <w:txbxContent>
-                          <w:p>
-                            <w:pPr>
-                              <w:spacing w:after="0"/>
-                            </w:pPr>
-                            <w:r>
-                              <w:rPr>
-                                <w:rFonts w:ascii="Roboto" w:hAnsi="Roboto"/>
-                                <w:color w:val="1F3864" w:themeColor="accent5" w:themeShade="80"/>
-                                <w:sz w:val="24"/>
-                                <w:szCs w:val="28"/>
-                              </w:rPr>
-                              <w:t xml:space="preserve">Código de validación: </w:t>
-                            </w:r>
-                            <w:r>
-                              <w:rPr>
-                                <w:rFonts w:ascii="Roboto" w:hAnsi="Roboto"/>
-                                <w:color w:val="1F3864" w:themeColor="accent5" w:themeShade="80"/>
-                                <w:sz w:val="24"/>
-                                <w:szCs w:val="28"/>
-                              </w:rPr>
-                              <w:fldChar w:fldCharType="begin"/>
-                            </w:r>
-                            <w:r>
-                              <w:rPr>
-                                <w:rFonts w:ascii="Roboto" w:hAnsi="Roboto"/>
-                                <w:color w:val="1F3864" w:themeColor="accent5" w:themeShade="80"/>
-                                <w:sz w:val="24"/>
-                                <w:szCs w:val="28"/>
-                              </w:rPr>
-                              <w:instrText xml:space="preserve"> MERGEFIELD CODIGO </w:instrText>
-                            </w:r>
-                            <w:r>
-                              <w:rPr>
-                                <w:rFonts w:ascii="Roboto" w:hAnsi="Roboto"/>
-                                <w:color w:val="1F3864" w:themeColor="accent5" w:themeShade="80"/>
-                                <w:sz w:val="24"/>
-                                <w:szCs w:val="28"/>
-                              </w:rPr>
-                              <w:fldChar w:fldCharType="separate"/>
-                            </w:r>
-                            <w:r>
-                              <w:rPr>
-                                <w:rFonts w:ascii="Roboto" w:hAnsi="Roboto"/>
-                                <w:noProof/>
-                                <w:color w:val="1F3864" w:themeColor="accent5" w:themeShade="80"/>
-                                <w:sz w:val="24"/>
-                                <w:szCs w:val="28"/>
-                              </w:rPr>
-                              <w:t>«CODIGO»</w:t>
-                            </w:r>
-                            <w:r>
-                              <w:rPr>
-                                <w:rFonts w:ascii="Roboto" w:hAnsi="Roboto"/>
-                                <w:color w:val="1F3864" w:themeColor="accent5" w:themeShade="80"/>
-                                <w:sz w:val="24"/>
-                                <w:szCs w:val="28"/>
-                              </w:rPr>
-                              <w:fldChar w:fldCharType="end"/>
-                            </w:r>
-                          </w:p>
-                          <w:p>
-                            <w:pPr>
-                              <w:spacing w:after="0"/>
-                              <w:jc w:val="center"/>
-                              <w:rPr>
-                                <w:rFonts w:ascii="Roboto" w:hAnsi="Roboto"/>
-                                <w:color w:val="2F5496" w:themeColor="accent5" w:themeShade="BF"/>
-                                <w:sz w:val="32"/>
-                                <w:szCs w:val="28"/>
-                              </w:rPr>
-                            </w:pPr>
-                          </w:p>
-                        </w:txbxContent>
-                      </wps:txbx>
-                      <wps:bodyPr rot="0" vert="horz" wrap="square" lIns="91440" tIns="45720" rIns="91440" bIns="45720" anchor="t" anchorCtr="0">
-                        <a:noAutofit/>
-                      </wps:bodyPr>
-                    </wps:wsp>
-                  </a:graphicData>
-                </a:graphic>
-                <wp14:sizeRelH relativeFrom="margin">
-                  <wp14:pctWidth>0</wp14:pctWidth>
-                </wp14:sizeRelH>
-                <wp14:sizeRelV relativeFrom="margin">
-                  <wp14:pctHeight>0</wp14:pctHeight>
-                </wp14:sizeRelV>
-              </wp:anchor>
-            </w:drawing>
-          </mc:Choice>
-          <mc:Fallback>
-            <w:pict>
-              <v:shape w14:anchorId="7330C7CC" id="_x0000_s1030" type="#_x0000_t202" style="position:absolute;margin-left:558.45pt;margin-top:382.1pt;width:194.65pt;height:25.75pt;z-index:251678720;visibility:visible;mso-wrap-style:square;mso-width-percent:0;mso-height-percent:0;mso-wrap-distance-left:9pt;mso-wrap-distance-top:3.6pt;mso-wrap-distance-right:9pt;mso-wrap-distance-bottom:3.6pt;mso-position-horizontal:absolute;mso-position-horizontal-relative:text;mso-position-vertical:absolute;mso-position-vertical-relative:text;mso-width-percent:0;mso-height-percent:0;mso-width-relative:margin;mso-height-relative:margin;v-text-anchor:top" o:gfxdata="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" filled="f" stroked="f">
-                <v:textbox>
-                  <w:txbxContent>
-                    <w:p>
-                      <w:pPr>
-                        <w:spacing w:after="0"/>
-                      </w:pPr>
-                      <w:r>
-                        <w:rPr>
-                          <w:rFonts w:ascii="Roboto" w:hAnsi="Roboto"/>
-                          <w:color w:val="1F3864" w:themeColor="accent5" w:themeShade="80"/>
-                          <w:sz w:val="24"/>
-                          <w:szCs w:val="28"/>
-                        </w:rPr>
-                        <w:t xml:space="preserve">Código de validación: </w:t>
-                      </w:r>
-                      <w:r>
-                        <w:rPr>
-                          <w:rFonts w:ascii="Roboto" w:hAnsi="Roboto"/>
-                          <w:color w:val="1F3864" w:themeColor="accent5" w:themeShade="80"/>
-                          <w:sz w:val="24"/>
-                          <w:szCs w:val="28"/>
-                        </w:rPr>
-                        <w:fldChar w:fldCharType="begin"/>
-                      </w:r>
-                      <w:r>
-                        <w:rPr>
-                          <w:rFonts w:ascii="Roboto" w:hAnsi="Roboto"/>
-                          <w:color w:val="1F3864" w:themeColor="accent5" w:themeShade="80"/>
-                          <w:sz w:val="24"/>
-                          <w:szCs w:val="28"/>
-                        </w:rPr>
-                        <w:instrText xml:space="preserve"> MERGEFIELD CODIGO </w:instrText>
-                      </w:r>
-                      <w:r>
-                        <w:rPr>
-                          <w:rFonts w:ascii="Roboto" w:hAnsi="Roboto"/>
-                          <w:color w:val="1F3864" w:themeColor="accent5" w:themeShade="80"/>
-                          <w:sz w:val="24"/>
-                          <w:szCs w:val="28"/>
-                        </w:rPr>
-                        <w:fldChar w:fldCharType="separate"/>
-                      </w:r>
-                      <w:r>
-                        <w:rPr>
-                          <w:rFonts w:ascii="Roboto" w:hAnsi="Roboto"/>
-                          <w:noProof/>
-                          <w:color w:val="1F3864" w:themeColor="accent5" w:themeShade="80"/>
-                          <w:sz w:val="24"/>
-                          <w:szCs w:val="28"/>
-                        </w:rPr>
-                        <w:t>«CODIGO»</w:t>
-                      </w:r>
-                      <w:r>
-                        <w:rPr>
-                          <w:rFonts w:ascii="Roboto" w:hAnsi="Roboto"/>
-                          <w:color w:val="1F3864" w:themeColor="accent5" w:themeShade="80"/>
-                          <w:sz w:val="24"/>
-                          <w:szCs w:val="28"/>
-                        </w:rPr>
-                        <w:fldChar w:fldCharType="end"/>
-                      </w:r>
-                    </w:p>
-                    <w:p>
-                      <w:pPr>
-                        <w:spacing w:after="0"/>
-                        <w:jc w:val="center"/>
+                          <w:szCs w:val="32"/>
+                        </w:rPr>
+                        <w:t xml:space="preserve"> de 2025 (</w:t>
+                      </w:r>
+                      <w:r>
                         <w:rPr>
                           <w:rFonts w:ascii="Roboto" w:hAnsi="Roboto"/>
                           <w:color w:val="2F5496" w:themeColor="accent5" w:themeShade="BF"/>
                           <w:sz w:val="32"/>
-                          <w:szCs w:val="28"/>
-                        </w:rPr>
-                      </w:pPr>
+                          <w:szCs w:val="32"/>
+                        </w:rPr>
+                        <w:t>«duracion»</w:t>
+                      </w:r>
+                      <w:r>
+                        <w:rPr>
+                          <w:rFonts w:ascii="Roboto" w:hAnsi="Roboto"/>
+                          <w:color w:val="2F5496" w:themeColor="accent5" w:themeShade="BF"/>
+                          <w:sz w:val="32"/>
+                          <w:szCs w:val="32"/>
+                        </w:rPr>
+                        <w:t xml:space="preserve"> de duración).</w:t>
+                      </w:r>
                     </w:p>
                   </w:txbxContent>
                 </v:textbox>
@@ -1174,10 +1254,7 @@
     <w:sectPr>
       <w:headerReference w:type="even" r:id="rId7"/>
       <w:headerReference w:type="default" r:id="rId8"/>
-      <w:footerReference w:type="even" r:id="rId9"/>
-      <w:footerReference w:type="default" r:id="rId10"/>
-      <w:headerReference w:type="first" r:id="rId11"/>
-      <w:footerReference w:type="first" r:id="rId12"/>
+      <w:headerReference w:type="first" r:id="rId9"/>
       <w:pgSz w:w="16838" w:h="11906" w:orient="landscape" w:code="9"/>
       <w:pgMar w:top="1701" w:right="1417" w:bottom="1701" w:left="1417" w:header="567" w:footer="0" w:gutter="0"/>
       <w:cols w:space="708"/>
@@ -1210,36 +1287,6 @@
     </w:p>
   </w:endnote>
 </w:endnotes>
-</file>
-
-<file path=word/footer1.xml><?xml version="1.0" encoding="utf-8"?>
-<w:ftr xmlns:wpc="http://schemas.microsoft.com/office/word/2010/wordprocessingCanvas" xmlns:cx="http://schemas.microsoft.com/office/drawing/2014/chartex" xmlns:cx1="http://schemas.microsoft.com/office/drawing/2015/9/8/chartex" xmlns:cx2="http://schemas.microsoft.com/office/drawing/2015/10/21/chartex" xmlns:cx3="http://schemas.microsoft.com/office/drawing/2016/5/9/chartex" xmlns:cx4="http://schemas.microsoft.com/office/drawing/2016/5/10/chartex" xmlns:cx5="http://schemas.microsoft.com/office/drawing/2016/5/11/chartex" xmlns:cx6="http://schemas.microsoft.com/office/drawing/2016/5/12/chartex" xmlns:cx7="http://schemas.microsoft.com/office/drawing/2016/5/13/chartex" xmlns:cx8="http://schemas.microsoft.com/office/drawing/2016/5/14/chartex" xmlns:mc="http://schemas.openxmlformats.org/markup-compatibility/2006" xmlns:aink="http://schemas.microsoft.com/office/drawing/2016/ink" xmlns:am3d="http://schemas.microsoft.com/office/drawing/2017/model3d" xmlns:o="urn:schemas-microsoft-com:office:office" xmlns:oel="http://schemas.microsoft.com/office/2019/extlst" xmlns:r="http://schemas.openxmlformats.org/officeDocument/2006/relationships" xmlns:m="http://schemas.openxmlformats.org/officeDocument/2006/math" xmlns:v="urn:schemas-microsoft-com:vml" xmlns:wp14="http://schemas.microsoft.com/office/word/2010/wordprocessingDrawing" xmlns:wp="http://schemas.openxmlformats.org/drawingml/2006/wordprocessingDrawing" xmlns:w10="urn:schemas-microsoft-com:office:word" xmlns:w="http://schemas.openxmlformats.org/wordprocessingml/2006/main" xmlns:w14="http://schemas.microsoft.com/office/word/2010/wordml" xmlns:w15="http://schemas.microsoft.com/office/word/2012/wordml" xmlns:w16cex="http://schemas.microsoft.com/office/word/2018/wordml/cex" xmlns:w16cid="http://schemas.microsoft.com/office/word/2016/wordml/cid" xmlns:w16="http://schemas.microsoft.com/office/word/2018/wordml" xmlns:w16du="http://schemas.microsoft.com/office/word/2023/wordml/word16du" xmlns:w16sdtdh="http://schemas.microsoft.com/office/word/2020/wordml/sdtdatahash" xmlns:w16sdtfl="http://schemas.microsoft.com/office/word/2024/wordml/sdtformatlock" xmlns:w16se="http://schemas.microsoft.com/office/word/2015/wordml/symex" xmlns:wpg="http://schemas.microsoft.com/office/word/2010/wordprocessingGroup" xmlns:wpi="http://schemas.microsoft.com/office/word/2010/wordprocessingInk" xmlns:wne="http://schemas.microsoft.com/office/word/2006/wordml" xmlns:wps="http://schemas.microsoft.com/office/word/2010/wordprocessingShape" mc:Ignorable="w14 w15 w16se w16cid w16 w16cex w16sdtdh w16sdtfl w16du wp14">
-  <w:p>
-    <w:pPr>
-      <w:pStyle w:val="Piedepgina"/>
-    </w:pPr>
-  </w:p>
-</w:ftr>
-</file>
-
-<file path=word/footer2.xml><?xml version="1.0" encoding="utf-8"?>
-<w:ftr xmlns:wpc="http://schemas.microsoft.com/office/word/2010/wordprocessingCanvas" xmlns:cx="http://schemas.microsoft.com/office/drawing/2014/chartex" xmlns:cx1="http://schemas.microsoft.com/office/drawing/2015/9/8/chartex" xmlns:cx2="http://schemas.microsoft.com/office/drawing/2015/10/21/chartex" xmlns:cx3="http://schemas.microsoft.com/office/drawing/2016/5/9/chartex" xmlns:cx4="http://schemas.microsoft.com/office/drawing/2016/5/10/chartex" xmlns:cx5="http://schemas.microsoft.com/office/drawing/2016/5/11/chartex" xmlns:cx6="http://schemas.microsoft.com/office/drawing/2016/5/12/chartex" xmlns:cx7="http://schemas.microsoft.com/office/drawing/2016/5/13/chartex" xmlns:cx8="http://schemas.microsoft.com/office/drawing/2016/5/14/chartex" xmlns:mc="http://schemas.openxmlformats.org/markup-compatibility/2006" xmlns:aink="http://schemas.microsoft.com/office/drawing/2016/ink" xmlns:am3d="http://schemas.microsoft.com/office/drawing/2017/model3d" xmlns:o="urn:schemas-microsoft-com:office:office" xmlns:oel="http://schemas.microsoft.com/office/2019/extlst" xmlns:r="http://schemas.openxmlformats.org/officeDocument/2006/relationships" xmlns:m="http://schemas.openxmlformats.org/officeDocument/2006/math" xmlns:v="urn:schemas-microsoft-com:vml" xmlns:wp14="http://schemas.microsoft.com/office/word/2010/wordprocessingDrawing" xmlns:wp="http://schemas.openxmlformats.org/drawingml/2006/wordprocessingDrawing" xmlns:w10="urn:schemas-microsoft-com:office:word" xmlns:w="http://schemas.openxmlformats.org/wordprocessingml/2006/main" xmlns:w14="http://schemas.microsoft.com/office/word/2010/wordml" xmlns:w15="http://schemas.microsoft.com/office/word/2012/wordml" xmlns:w16cex="http://schemas.microsoft.com/office/word/2018/wordml/cex" xmlns:w16cid="http://schemas.microsoft.com/office/word/2016/wordml/cid" xmlns:w16="http://schemas.microsoft.com/office/word/2018/wordml" xmlns:w16du="http://schemas.microsoft.com/office/word/2023/wordml/word16du" xmlns:w16sdtdh="http://schemas.microsoft.com/office/word/2020/wordml/sdtdatahash" xmlns:w16sdtfl="http://schemas.microsoft.com/office/word/2024/wordml/sdtformatlock" xmlns:w16se="http://schemas.microsoft.com/office/word/2015/wordml/symex" xmlns:wpg="http://schemas.microsoft.com/office/word/2010/wordprocessingGroup" xmlns:wpi="http://schemas.microsoft.com/office/word/2010/wordprocessingInk" xmlns:wne="http://schemas.microsoft.com/office/word/2006/wordml" xmlns:wps="http://schemas.microsoft.com/office/word/2010/wordprocessingShape" mc:Ignorable="w14 w15 w16se w16cid w16 w16cex w16sdtdh w16sdtfl w16du wp14">
-  <w:p>
-    <w:pPr>
-      <w:pStyle w:val="Piedepgina"/>
-    </w:pPr>
-  </w:p>
-</w:ftr>
-</file>
-
-<file path=word/footer3.xml><?xml version="1.0" encoding="utf-8"?>
-<w:ftr xmlns:wpc="http://schemas.microsoft.com/office/word/2010/wordprocessingCanvas" xmlns:cx="http://schemas.microsoft.com/office/drawing/2014/chartex" xmlns:cx1="http://schemas.microsoft.com/office/drawing/2015/9/8/chartex" xmlns:cx2="http://schemas.microsoft.com/office/drawing/2015/10/21/chartex" xmlns:cx3="http://schemas.microsoft.com/office/drawing/2016/5/9/chartex" xmlns:cx4="http://schemas.microsoft.com/office/drawing/2016/5/10/chartex" xmlns:cx5="http://schemas.microsoft.com/office/drawing/2016/5/11/chartex" xmlns:cx6="http://schemas.microsoft.com/office/drawing/2016/5/12/chartex" xmlns:cx7="http://schemas.microsoft.com/office/drawing/2016/5/13/chartex" xmlns:cx8="http://schemas.microsoft.com/office/drawing/2016/5/14/chartex" xmlns:mc="http://schemas.openxmlformats.org/markup-compatibility/2006" xmlns:aink="http://schemas.microsoft.com/office/drawing/2016/ink" xmlns:am3d="http://schemas.microsoft.com/office/drawing/2017/model3d" xmlns:o="urn:schemas-microsoft-com:office:office" xmlns:oel="http://schemas.microsoft.com/office/2019/extlst" xmlns:r="http://schemas.openxmlformats.org/officeDocument/2006/relationships" xmlns:m="http://schemas.openxmlformats.org/officeDocument/2006/math" xmlns:v="urn:schemas-microsoft-com:vml" xmlns:wp14="http://schemas.microsoft.com/office/word/2010/wordprocessingDrawing" xmlns:wp="http://schemas.openxmlformats.org/drawingml/2006/wordprocessingDrawing" xmlns:w10="urn:schemas-microsoft-com:office:word" xmlns:w="http://schemas.openxmlformats.org/wordprocessingml/2006/main" xmlns:w14="http://schemas.microsoft.com/office/word/2010/wordml" xmlns:w15="http://schemas.microsoft.com/office/word/2012/wordml" xmlns:w16cex="http://schemas.microsoft.com/office/word/2018/wordml/cex" xmlns:w16cid="http://schemas.microsoft.com/office/word/2016/wordml/cid" xmlns:w16="http://schemas.microsoft.com/office/word/2018/wordml" xmlns:w16du="http://schemas.microsoft.com/office/word/2023/wordml/word16du" xmlns:w16sdtdh="http://schemas.microsoft.com/office/word/2020/wordml/sdtdatahash" xmlns:w16sdtfl="http://schemas.microsoft.com/office/word/2024/wordml/sdtformatlock" xmlns:w16se="http://schemas.microsoft.com/office/word/2015/wordml/symex" xmlns:wpg="http://schemas.microsoft.com/office/word/2010/wordprocessingGroup" xmlns:wpi="http://schemas.microsoft.com/office/word/2010/wordprocessingInk" xmlns:wne="http://schemas.microsoft.com/office/word/2006/wordml" xmlns:wps="http://schemas.microsoft.com/office/word/2010/wordprocessingShape" mc:Ignorable="w14 w15 w16se w16cid w16 w16cex w16sdtdh w16sdtfl w16du wp14">
-  <w:p>
-    <w:pPr>
-      <w:pStyle w:val="Piedepgina"/>
-    </w:pPr>
-  </w:p>
-</w:ftr>
 </file>
 
 <file path=word/footnotes.xml><?xml version="1.0" encoding="utf-8"?>
@@ -1423,7 +1470,7 @@
                       <w:txbxContent>
                         <w:p>
                           <w:pPr>
-                            <w:jc w:val="right"/>
+                            <w:jc w:val="center"/>
                             <w:rPr>
                               <w:rFonts w:ascii="Roboto" w:hAnsi="Roboto" w:cs="Segoe UI Semibold"/>
                               <w:color w:val="2F5496" w:themeColor="accent5" w:themeShade="BF"/>
@@ -1434,38 +1481,34 @@
                           <w:r>
                             <w:rPr>
                               <w:rFonts w:ascii="Roboto" w:hAnsi="Roboto" w:cs="Segoe UI Semibold"/>
+                              <w:b/>
+                              <w:bCs/>
                               <w:color w:val="2F5496" w:themeColor="accent5" w:themeShade="BF"/>
                               <w:sz w:val="24"/>
-                              <w:lang w:val="es-ES"/>
                             </w:rPr>
-                            <w:t>Septiembre</w:t>
+                            <w:t>«</w:t>
                           </w:r>
+                          <w:proofErr w:type="spellStart"/>
                           <w:r>
                             <w:rPr>
                               <w:rFonts w:ascii="Roboto" w:hAnsi="Roboto" w:cs="Segoe UI Semibold"/>
+                              <w:b/>
+                              <w:bCs/>
                               <w:color w:val="2F5496" w:themeColor="accent5" w:themeShade="BF"/>
                               <w:sz w:val="24"/>
-                              <w:lang w:val="es-ES"/>
                             </w:rPr>
-                            <w:t xml:space="preserve"> de 2</w:t>
+                            <w:t>mes_anio</w:t>
                           </w:r>
+                          <w:proofErr w:type="spellEnd"/>
                           <w:r>
                             <w:rPr>
                               <w:rFonts w:ascii="Roboto" w:hAnsi="Roboto" w:cs="Segoe UI Semibold"/>
+                              <w:b/>
+                              <w:bCs/>
                               <w:color w:val="2F5496" w:themeColor="accent5" w:themeShade="BF"/>
                               <w:sz w:val="24"/>
-                              <w:lang w:val="es-ES"/>
                             </w:rPr>
-                            <w:t>02</w:t>
-                          </w:r>
-                          <w:r>
-                            <w:rPr>
-                              <w:rFonts w:ascii="Roboto" w:hAnsi="Roboto" w:cs="Segoe UI Semibold"/>
-                              <w:color w:val="2F5496" w:themeColor="accent5" w:themeShade="BF"/>
-                              <w:sz w:val="24"/>
-                              <w:lang w:val="es-ES"/>
-                            </w:rPr>
-                            <w:t>5</w:t>
+                            <w:t>»</w:t>
                           </w:r>
                         </w:p>
                       </w:txbxContent>
@@ -1496,7 +1539,7 @@
                 <w:txbxContent>
                   <w:p>
                     <w:pPr>
-                      <w:jc w:val="right"/>
+                      <w:jc w:val="center"/>
                       <w:rPr>
                         <w:rFonts w:ascii="Roboto" w:hAnsi="Roboto" w:cs="Segoe UI Semibold"/>
                         <w:color w:val="2F5496" w:themeColor="accent5" w:themeShade="BF"/>
@@ -1507,38 +1550,34 @@
                     <w:r>
                       <w:rPr>
                         <w:rFonts w:ascii="Roboto" w:hAnsi="Roboto" w:cs="Segoe UI Semibold"/>
+                        <w:b/>
+                        <w:bCs/>
                         <w:color w:val="2F5496" w:themeColor="accent5" w:themeShade="BF"/>
                         <w:sz w:val="24"/>
-                        <w:lang w:val="es-ES"/>
                       </w:rPr>
-                      <w:t>Septiembre</w:t>
+                      <w:t>«</w:t>
                     </w:r>
+                    <w:proofErr w:type="spellStart"/>
                     <w:r>
                       <w:rPr>
                         <w:rFonts w:ascii="Roboto" w:hAnsi="Roboto" w:cs="Segoe UI Semibold"/>
+                        <w:b/>
+                        <w:bCs/>
                         <w:color w:val="2F5496" w:themeColor="accent5" w:themeShade="BF"/>
                         <w:sz w:val="24"/>
-                        <w:lang w:val="es-ES"/>
                       </w:rPr>
-                      <w:t xml:space="preserve"> de 2</w:t>
+                      <w:t>mes_anio</w:t>
                     </w:r>
+                    <w:proofErr w:type="spellEnd"/>
                     <w:r>
                       <w:rPr>
                         <w:rFonts w:ascii="Roboto" w:hAnsi="Roboto" w:cs="Segoe UI Semibold"/>
+                        <w:b/>
+                        <w:bCs/>
                         <w:color w:val="2F5496" w:themeColor="accent5" w:themeShade="BF"/>
                         <w:sz w:val="24"/>
-                        <w:lang w:val="es-ES"/>
                       </w:rPr>
-                      <w:t>02</w:t>
-                    </w:r>
-                    <w:r>
-                      <w:rPr>
-                        <w:rFonts w:ascii="Roboto" w:hAnsi="Roboto" w:cs="Segoe UI Semibold"/>
-                        <w:color w:val="2F5496" w:themeColor="accent5" w:themeShade="BF"/>
-                        <w:sz w:val="24"/>
-                        <w:lang w:val="es-ES"/>
-                      </w:rPr>
-                      <w:t>5</w:t>
+                      <w:t>»</w:t>
                     </w:r>
                   </w:p>
                 </w:txbxContent>

</xml_diff>

<commit_message>
Alinea el color del Codigo de validacion con el tono del cuerpo del certificado
</commit_message>
<xml_diff>
--- a/formato de certificado de asistencia.docx
+++ b/formato de certificado de asistencia.docx
@@ -525,7 +525,7 @@
                             <w:r>
                               <w:rPr>
                                 <w:rFonts w:ascii="Roboto" w:hAnsi="Roboto"/>
-                                <w:color w:val="1F3864" w:themeColor="accent5" w:themeShade="80"/>
+                                <w:color w:val="2F5496" w:themeColor="accent5" w:themeShade="BF"/>
                                 <w:sz w:val="24"/>
                                 <w:szCs w:val="28"/>
                               </w:rPr>
@@ -534,7 +534,7 @@
                             <w:r>
                               <w:rPr>
                                 <w:rFonts w:ascii="Roboto" w:hAnsi="Roboto"/>
-                                <w:color w:val="1F3864" w:themeColor="accent5" w:themeShade="80"/>
+                                <w:color w:val="2F5496" w:themeColor="accent5" w:themeShade="BF"/>
                                 <w:sz w:val="24"/>
                                 <w:szCs w:val="28"/>
                               </w:rPr>
@@ -543,7 +543,7 @@
                             <w:r>
                               <w:rPr>
                                 <w:rFonts w:ascii="Roboto" w:hAnsi="Roboto"/>
-                                <w:color w:val="1F3864" w:themeColor="accent5" w:themeShade="80"/>
+                                <w:color w:val="2F5496" w:themeColor="accent5" w:themeShade="BF"/>
                                 <w:sz w:val="24"/>
                                 <w:szCs w:val="28"/>
                               </w:rPr>
@@ -552,7 +552,7 @@
                             <w:r>
                               <w:rPr>
                                 <w:rFonts w:ascii="Roboto" w:hAnsi="Roboto"/>
-                                <w:color w:val="1F3864" w:themeColor="accent5" w:themeShade="80"/>
+                                <w:color w:val="2F5496" w:themeColor="accent5" w:themeShade="BF"/>
                                 <w:sz w:val="24"/>
                                 <w:szCs w:val="28"/>
                               </w:rPr>
@@ -562,7 +562,7 @@
                               <w:rPr>
                                 <w:rFonts w:ascii="Roboto" w:hAnsi="Roboto"/>
                                 <w:noProof/>
-                                <w:color w:val="1F3864" w:themeColor="accent5" w:themeShade="80"/>
+                                <w:color w:val="2F5496" w:themeColor="accent5" w:themeShade="BF"/>
                                 <w:sz w:val="24"/>
                                 <w:szCs w:val="28"/>
                               </w:rPr>
@@ -571,7 +571,7 @@
                             <w:r>
                               <w:rPr>
                                 <w:rFonts w:ascii="Roboto" w:hAnsi="Roboto"/>
-                                <w:color w:val="1F3864" w:themeColor="accent5" w:themeShade="80"/>
+                                <w:color w:val="2F5496" w:themeColor="accent5" w:themeShade="BF"/>
                                 <w:sz w:val="24"/>
                                 <w:szCs w:val="28"/>
                               </w:rPr>
@@ -619,7 +619,7 @@
                       <w:r>
                         <w:rPr>
                           <w:rFonts w:ascii="Roboto" w:hAnsi="Roboto"/>
-                          <w:color w:val="1F3864" w:themeColor="accent5" w:themeShade="80"/>
+                          <w:color w:val="2F5496" w:themeColor="accent5" w:themeShade="BF"/>
                           <w:sz w:val="24"/>
                           <w:szCs w:val="28"/>
                         </w:rPr>
@@ -628,7 +628,7 @@
                       <w:r>
                         <w:rPr>
                           <w:rFonts w:ascii="Roboto" w:hAnsi="Roboto"/>
-                          <w:color w:val="1F3864" w:themeColor="accent5" w:themeShade="80"/>
+                          <w:color w:val="2F5496" w:themeColor="accent5" w:themeShade="BF"/>
                           <w:sz w:val="24"/>
                           <w:szCs w:val="28"/>
                         </w:rPr>
@@ -637,7 +637,7 @@
                       <w:r>
                         <w:rPr>
                           <w:rFonts w:ascii="Roboto" w:hAnsi="Roboto"/>
-                          <w:color w:val="1F3864" w:themeColor="accent5" w:themeShade="80"/>
+                          <w:color w:val="2F5496" w:themeColor="accent5" w:themeShade="BF"/>
                           <w:sz w:val="24"/>
                           <w:szCs w:val="28"/>
                         </w:rPr>
@@ -646,7 +646,7 @@
                       <w:r>
                         <w:rPr>
                           <w:rFonts w:ascii="Roboto" w:hAnsi="Roboto"/>
-                          <w:color w:val="1F3864" w:themeColor="accent5" w:themeShade="80"/>
+                          <w:color w:val="2F5496" w:themeColor="accent5" w:themeShade="BF"/>
                           <w:sz w:val="24"/>
                           <w:szCs w:val="28"/>
                         </w:rPr>
@@ -656,7 +656,7 @@
                         <w:rPr>
                           <w:rFonts w:ascii="Roboto" w:hAnsi="Roboto"/>
                           <w:noProof/>
-                          <w:color w:val="1F3864" w:themeColor="accent5" w:themeShade="80"/>
+                          <w:color w:val="2F5496" w:themeColor="accent5" w:themeShade="BF"/>
                           <w:sz w:val="24"/>
                           <w:szCs w:val="28"/>
                         </w:rPr>
@@ -665,7 +665,7 @@
                       <w:r>
                         <w:rPr>
                           <w:rFonts w:ascii="Roboto" w:hAnsi="Roboto"/>
-                          <w:color w:val="1F3864" w:themeColor="accent5" w:themeShade="80"/>
+                          <w:color w:val="2F5496" w:themeColor="accent5" w:themeShade="BF"/>
                           <w:sz w:val="24"/>
                           <w:szCs w:val="28"/>
                         </w:rPr>

</xml_diff>